<commit_message>
feat: concurrentes avec modèles différents (A vert Sahel, B bordeaux NTP)
Co-authored-by: NigerCertify-offensive-lab <openaiabou@gmail.com>
</commit_message>
<xml_diff>
--- a/Facture_Proforma_OPVN_Concurrent_A.docx
+++ b/Facture_Proforma_OPVN_Concurrent_A.docx
@@ -9,75 +9,120 @@
         <w:tblLook w:firstColumn="1" w:firstRow="1" w:lastColumn="0" w:lastRow="0" w:noHBand="0" w:noVBand="1" w:val="04A0"/>
       </w:tblPr>
       <w:tblGrid>
-        <w:gridCol w:w="5270"/>
-        <w:gridCol w:w="5270"/>
+        <w:gridCol w:w="10652"/>
       </w:tblGrid>
       <w:tr>
         <w:tc>
           <w:tcPr>
-            <w:tcW w:type="dxa" w:w="5270"/>
+            <w:tcW w:type="dxa" w:w="10652"/>
+            <w:shd w:val="clear" w:fill="1B7A3D"/>
           </w:tcPr>
           <w:p>
             <w:pPr>
-              <w:jc w:val="left"/>
+              <w:jc w:val="center"/>
+            </w:pPr>
+            <w:r/>
+            <w:r>
+              <w:rPr>
+                <w:b/>
+                <w:color w:val="FFFFFF"/>
+                <w:sz w:val="32"/>
+              </w:rPr>
+              <w:t>ETS SAHEL CONFECTION &amp; SERVICES</w:t>
+            </w:r>
+          </w:p>
+          <w:p>
+            <w:pPr>
+              <w:jc w:val="center"/>
             </w:pPr>
             <w:r>
-              <w:t>Ets Sahel Confection &amp; Services</w:t>
+              <w:rPr>
+                <w:color w:val="FFFFFF"/>
+                <w:sz w:val="16"/>
+              </w:rPr>
+              <w:t>Confection — Broderie — Tenues professionnelles  •  Quartier Lazaret, Niamey  •  Tél : +227 90 12 34 56</w:t>
               <w:br/>
-              <w:t>Confection &amp; Fourniture de tenues professionnelles</w:t>
-              <w:br/>
-              <w:t>Adresse : Quartier Lazaret, Niamey — Tél : +227 90 12 34 56</w:t>
-              <w:br/>
-              <w:t>E-mail : sahel.confection@ne.com — NIF : 45210/S</w:t>
-            </w:r>
-          </w:p>
-        </w:tc>
-        <w:tc>
-          <w:tcPr>
-            <w:tcW w:type="dxa" w:w="5270"/>
-            <w:shd w:val="clear" w:fill="E8F0FE"/>
-          </w:tcPr>
-          <w:p>
-            <w:pPr>
-              <w:jc w:val="right"/>
-            </w:pPr>
-            <w:r>
-              <w:t>FACTURE PROFORMA</w:t>
-              <w:br/>
-              <w:t>N° : PF-2026-0914-002</w:t>
-              <w:br/>
-              <w:t>Date : 14/09/2026</w:t>
-              <w:br/>
-              <w:t>Validité : 14/10/2026 (30 jours)</w:t>
+              <w:t>sahel.confection@ne.com  —  NIF : 45210/S</w:t>
             </w:r>
           </w:p>
         </w:tc>
       </w:tr>
     </w:tbl>
     <w:p/>
+    <w:tbl>
+      <w:tblPr>
+        <w:tblW w:type="auto" w:w="0"/>
+        <w:jc w:val="center"/>
+        <w:tblLook w:firstColumn="1" w:firstRow="1" w:lastColumn="0" w:lastRow="0" w:noHBand="0" w:noVBand="1" w:val="04A0"/>
+      </w:tblPr>
+      <w:tblGrid>
+        <w:gridCol w:w="5326"/>
+        <w:gridCol w:w="5326"/>
+      </w:tblGrid>
+      <w:tr>
+        <w:tc>
+          <w:tcPr>
+            <w:tcW w:type="dxa" w:w="5326"/>
+            <w:shd w:val="clear" w:fill="EAF5EC"/>
+          </w:tcPr>
+          <w:p>
+            <w:pPr>
+              <w:jc w:val="left"/>
+            </w:pPr>
+            <w:r/>
+            <w:r>
+              <w:rPr>
+                <w:b w:val="0"/>
+                <w:i w:val="0"/>
+                <w:color w:val="334155"/>
+                <w:sz w:val="17"/>
+              </w:rPr>
+              <w:t>Devis proforma — Client : OPVN (Office des Produits Vivriers du Niger, Niamey)</w:t>
+              <w:br/>
+              <w:t>Objet : Tenues de travail avec logo OPVN — Plantons, Manœuvres, Chauffeurs, Gardiens, Mécaniciens, Graisseurs</w:t>
+            </w:r>
+          </w:p>
+        </w:tc>
+        <w:tc>
+          <w:tcPr>
+            <w:tcW w:type="dxa" w:w="5326"/>
+            <w:shd w:val="clear" w:fill="FFFFFF"/>
+          </w:tcPr>
+          <w:p>
+            <w:pPr>
+              <w:jc w:val="right"/>
+            </w:pPr>
+            <w:r/>
+            <w:r>
+              <w:rPr>
+                <w:b/>
+                <w:i w:val="0"/>
+                <w:color w:val="1B7A3D"/>
+                <w:sz w:val="18"/>
+              </w:rPr>
+              <w:t>N° PF-2026-0914-002</w:t>
+              <w:br/>
+              <w:t>Date : 14/09/2026</w:t>
+              <w:br/>
+              <w:t>Échéance : 14/10/2026</w:t>
+              <w:br/>
+              <w:t>Validité : 30 jours</w:t>
+            </w:r>
+          </w:p>
+        </w:tc>
+      </w:tr>
+    </w:tbl>
     <w:p>
       <w:pPr>
-        <w:jc w:val="center"/>
+        <w:jc w:val="left"/>
       </w:pPr>
       <w:r>
         <w:rPr>
           <w:b/>
-          <w:color w:val="0F2A44"/>
-          <w:sz w:val="30"/>
+          <w:color w:val="1B7A3D"/>
+          <w:sz w:val="26"/>
         </w:rPr>
-        <w:t>FACTURE PROFORMA — TENUES DE TRAVAIL AVEC LOGO OPVN</w:t>
-      </w:r>
-    </w:p>
-    <w:p>
-      <w:pPr>
-        <w:jc w:val="center"/>
-      </w:pPr>
-      <w:r>
-        <w:rPr>
-          <w:color w:val="5A6C7D"/>
-          <w:sz w:val="18"/>
-        </w:rPr>
-        <w:t>Établie en Francs CFA (FCFA) — Tous les articles avec logo OPVN</w:t>
+        <w:t>Facture proforma en francs CFA</w:t>
       </w:r>
     </w:p>
     <w:tbl>
@@ -88,62 +133,17 @@
         <w:tblLook w:firstColumn="1" w:firstRow="1" w:lastColumn="0" w:lastRow="0" w:noHBand="0" w:noVBand="1" w:val="04A0"/>
       </w:tblPr>
       <w:tblGrid>
-        <w:gridCol w:w="5270"/>
-        <w:gridCol w:w="5270"/>
+        <w:gridCol w:w="2130"/>
+        <w:gridCol w:w="2130"/>
+        <w:gridCol w:w="2130"/>
+        <w:gridCol w:w="2130"/>
+        <w:gridCol w:w="2130"/>
       </w:tblGrid>
       <w:tr>
         <w:tc>
           <w:tcPr>
-            <w:tcW w:type="dxa" w:w="5270"/>
-            <w:shd w:val="clear" w:fill="F2F4F7"/>
-          </w:tcPr>
-          <w:p>
-            <w:r>
-              <w:t>Client : OPVN</w:t>
-              <w:br/>
-              <w:t>Office des Produits Vivriers du Niger</w:t>
-              <w:br/>
-              <w:t>Niamey — Niger</w:t>
-            </w:r>
-          </w:p>
-        </w:tc>
-        <w:tc>
-          <w:tcPr>
-            <w:tcW w:type="dxa" w:w="5270"/>
-            <w:shd w:val="clear" w:fill="F2F4F7"/>
-          </w:tcPr>
-          <w:p>
-            <w:r>
-              <w:t>Objet : Confection et fourniture de tenues de travail</w:t>
-              <w:br/>
-              <w:t>Plantons, Manœuvres, Chauffeurs, Gardiens,</w:t>
-              <w:br/>
-              <w:t>Mécaniciens et Graisseurs — avec logo OPVN</w:t>
-            </w:r>
-          </w:p>
-        </w:tc>
-      </w:tr>
-    </w:tbl>
-    <w:p/>
-    <w:tbl>
-      <w:tblPr>
-        <w:tblStyle w:val="TableGrid"/>
-        <w:tblW w:type="auto" w:w="0"/>
-        <w:jc w:val="center"/>
-        <w:tblLook w:firstColumn="1" w:firstRow="1" w:lastColumn="0" w:lastRow="0" w:noHBand="0" w:noVBand="1" w:val="04A0"/>
-      </w:tblPr>
-      <w:tblGrid>
-        <w:gridCol w:w="2108"/>
-        <w:gridCol w:w="2108"/>
-        <w:gridCol w:w="2108"/>
-        <w:gridCol w:w="2108"/>
-        <w:gridCol w:w="2108"/>
-      </w:tblGrid>
-      <w:tr>
-        <w:tc>
-          <w:tcPr>
-            <w:tcW w:type="dxa" w:w="2108"/>
-            <w:shd w:val="clear" w:fill="0F2A44"/>
+            <w:tcW w:type="dxa" w:w="2130"/>
+            <w:shd w:val="clear" w:fill="1B7A3D"/>
           </w:tcPr>
           <w:p>
             <w:pPr>
@@ -153,17 +153,18 @@
             <w:r>
               <w:rPr>
                 <w:b/>
+                <w:i w:val="0"/>
                 <w:color w:val="FFFFFF"/>
                 <w:sz w:val="17"/>
               </w:rPr>
-              <w:t>N°</w:t>
+              <w:t>RÉF</w:t>
             </w:r>
           </w:p>
         </w:tc>
         <w:tc>
           <w:tcPr>
-            <w:tcW w:type="dxa" w:w="2108"/>
-            <w:shd w:val="clear" w:fill="0F2A44"/>
+            <w:tcW w:type="dxa" w:w="2130"/>
+            <w:shd w:val="clear" w:fill="1B7A3D"/>
           </w:tcPr>
           <w:p>
             <w:pPr>
@@ -173,17 +174,18 @@
             <w:r>
               <w:rPr>
                 <w:b/>
+                <w:i w:val="0"/>
                 <w:color w:val="FFFFFF"/>
                 <w:sz w:val="17"/>
               </w:rPr>
-              <w:t>DÉSIGNATION</w:t>
+              <w:t>DESCRIPTION</w:t>
             </w:r>
           </w:p>
         </w:tc>
         <w:tc>
           <w:tcPr>
-            <w:tcW w:type="dxa" w:w="2108"/>
-            <w:shd w:val="clear" w:fill="0F2A44"/>
+            <w:tcW w:type="dxa" w:w="2130"/>
+            <w:shd w:val="clear" w:fill="1B7A3D"/>
           </w:tcPr>
           <w:p>
             <w:pPr>
@@ -193,6 +195,7 @@
             <w:r>
               <w:rPr>
                 <w:b/>
+                <w:i w:val="0"/>
                 <w:color w:val="FFFFFF"/>
                 <w:sz w:val="17"/>
               </w:rPr>
@@ -202,8 +205,8 @@
         </w:tc>
         <w:tc>
           <w:tcPr>
-            <w:tcW w:type="dxa" w:w="2108"/>
-            <w:shd w:val="clear" w:fill="0F2A44"/>
+            <w:tcW w:type="dxa" w:w="2130"/>
+            <w:shd w:val="clear" w:fill="1B7A3D"/>
           </w:tcPr>
           <w:p>
             <w:pPr>
@@ -213,17 +216,18 @@
             <w:r>
               <w:rPr>
                 <w:b/>
+                <w:i w:val="0"/>
                 <w:color w:val="FFFFFF"/>
                 <w:sz w:val="17"/>
               </w:rPr>
-              <w:t>P.U. (FCFA)</w:t>
+              <w:t>P.U. FCFA</w:t>
             </w:r>
           </w:p>
         </w:tc>
         <w:tc>
           <w:tcPr>
-            <w:tcW w:type="dxa" w:w="2108"/>
-            <w:shd w:val="clear" w:fill="0F2A44"/>
+            <w:tcW w:type="dxa" w:w="2130"/>
+            <w:shd w:val="clear" w:fill="1B7A3D"/>
           </w:tcPr>
           <w:p>
             <w:pPr>
@@ -233,10 +237,11 @@
             <w:r>
               <w:rPr>
                 <w:b/>
+                <w:i w:val="0"/>
                 <w:color w:val="FFFFFF"/>
                 <w:sz w:val="17"/>
               </w:rPr>
-              <w:t>MONTANT (FCFA)</w:t>
+              <w:t>TOTAL FCFA</w:t>
             </w:r>
           </w:p>
         </w:tc>
@@ -244,7 +249,7 @@
       <w:tr>
         <w:tc>
           <w:tcPr>
-            <w:tcW w:type="dxa" w:w="2108"/>
+            <w:tcW w:type="dxa" w:w="2130"/>
           </w:tcPr>
           <w:p>
             <w:pPr>
@@ -253,28 +258,32 @@
             <w:r/>
             <w:r>
               <w:rPr>
+                <w:b/>
+                <w:i w:val="0"/>
                 <w:sz w:val="17"/>
               </w:rPr>
-              <w:t>1</w:t>
+              <w:t>A-01</w:t>
             </w:r>
           </w:p>
         </w:tc>
         <w:tc>
           <w:tcPr>
-            <w:tcW w:type="dxa" w:w="2108"/>
+            <w:tcW w:type="dxa" w:w="2130"/>
           </w:tcPr>
           <w:p>
             <w:r/>
             <w:r>
               <w:rPr>
                 <w:b/>
+                <w:i w:val="0"/>
+                <w:color w:val="4B5B6B"/>
                 <w:sz w:val="17"/>
               </w:rPr>
               <w:t>Ensemble T-shirt + Pantalon + Casquette avec logo OPVN</w:t>
             </w:r>
             <w:r>
               <w:rPr>
-                <w:color w:val="344054"/>
+                <w:color w:val="4B5B6B"/>
                 <w:sz w:val="15"/>
               </w:rPr>
               <w:br/>
@@ -284,7 +293,7 @@
         </w:tc>
         <w:tc>
           <w:tcPr>
-            <w:tcW w:type="dxa" w:w="2108"/>
+            <w:tcW w:type="dxa" w:w="2130"/>
           </w:tcPr>
           <w:p>
             <w:pPr>
@@ -293,6 +302,8 @@
             <w:r/>
             <w:r>
               <w:rPr>
+                <w:b w:val="0"/>
+                <w:i w:val="0"/>
                 <w:sz w:val="17"/>
               </w:rPr>
               <w:t>200</w:t>
@@ -301,7 +312,7 @@
         </w:tc>
         <w:tc>
           <w:tcPr>
-            <w:tcW w:type="dxa" w:w="2108"/>
+            <w:tcW w:type="dxa" w:w="2130"/>
           </w:tcPr>
           <w:p>
             <w:pPr>
@@ -310,6 +321,8 @@
             <w:r/>
             <w:r>
               <w:rPr>
+                <w:b w:val="0"/>
+                <w:i w:val="0"/>
                 <w:sz w:val="17"/>
               </w:rPr>
               <w:t>32 500</w:t>
@@ -318,7 +331,7 @@
         </w:tc>
         <w:tc>
           <w:tcPr>
-            <w:tcW w:type="dxa" w:w="2108"/>
+            <w:tcW w:type="dxa" w:w="2130"/>
           </w:tcPr>
           <w:p>
             <w:pPr>
@@ -327,6 +340,9 @@
             <w:r/>
             <w:r>
               <w:rPr>
+                <w:b/>
+                <w:i w:val="0"/>
+                <w:color w:val="1B7A3D"/>
                 <w:sz w:val="17"/>
               </w:rPr>
               <w:t>6 500 000</w:t>
@@ -337,8 +353,8 @@
       <w:tr>
         <w:tc>
           <w:tcPr>
-            <w:tcW w:type="dxa" w:w="2108"/>
-            <w:shd w:val="clear" w:fill="F8FAFC"/>
+            <w:tcW w:type="dxa" w:w="2130"/>
+            <w:shd w:val="clear" w:fill="F2F9F3"/>
           </w:tcPr>
           <w:p>
             <w:pPr>
@@ -347,29 +363,33 @@
             <w:r/>
             <w:r>
               <w:rPr>
+                <w:b/>
+                <w:i w:val="0"/>
                 <w:sz w:val="17"/>
               </w:rPr>
-              <w:t>2</w:t>
+              <w:t>A-02</w:t>
             </w:r>
           </w:p>
         </w:tc>
         <w:tc>
           <w:tcPr>
-            <w:tcW w:type="dxa" w:w="2108"/>
-            <w:shd w:val="clear" w:fill="F8FAFC"/>
+            <w:tcW w:type="dxa" w:w="2130"/>
+            <w:shd w:val="clear" w:fill="F2F9F3"/>
           </w:tcPr>
           <w:p>
             <w:r/>
             <w:r>
               <w:rPr>
                 <w:b/>
+                <w:i w:val="0"/>
+                <w:color w:val="4B5B6B"/>
                 <w:sz w:val="17"/>
               </w:rPr>
               <w:t>Contre-veste marron avec logo OPVN</w:t>
             </w:r>
             <w:r>
               <w:rPr>
-                <w:color w:val="344054"/>
+                <w:color w:val="4B5B6B"/>
                 <w:sz w:val="15"/>
               </w:rPr>
               <w:br/>
@@ -379,8 +399,8 @@
         </w:tc>
         <w:tc>
           <w:tcPr>
-            <w:tcW w:type="dxa" w:w="2108"/>
-            <w:shd w:val="clear" w:fill="F8FAFC"/>
+            <w:tcW w:type="dxa" w:w="2130"/>
+            <w:shd w:val="clear" w:fill="F2F9F3"/>
           </w:tcPr>
           <w:p>
             <w:pPr>
@@ -389,6 +409,8 @@
             <w:r/>
             <w:r>
               <w:rPr>
+                <w:b w:val="0"/>
+                <w:i w:val="0"/>
                 <w:sz w:val="17"/>
               </w:rPr>
               <w:t>108</w:t>
@@ -397,8 +419,8 @@
         </w:tc>
         <w:tc>
           <w:tcPr>
-            <w:tcW w:type="dxa" w:w="2108"/>
-            <w:shd w:val="clear" w:fill="F8FAFC"/>
+            <w:tcW w:type="dxa" w:w="2130"/>
+            <w:shd w:val="clear" w:fill="F2F9F3"/>
           </w:tcPr>
           <w:p>
             <w:pPr>
@@ -407,6 +429,8 @@
             <w:r/>
             <w:r>
               <w:rPr>
+                <w:b w:val="0"/>
+                <w:i w:val="0"/>
                 <w:sz w:val="17"/>
               </w:rPr>
               <w:t>37 500</w:t>
@@ -415,8 +439,8 @@
         </w:tc>
         <w:tc>
           <w:tcPr>
-            <w:tcW w:type="dxa" w:w="2108"/>
-            <w:shd w:val="clear" w:fill="F8FAFC"/>
+            <w:tcW w:type="dxa" w:w="2130"/>
+            <w:shd w:val="clear" w:fill="F2F9F3"/>
           </w:tcPr>
           <w:p>
             <w:pPr>
@@ -425,6 +449,9 @@
             <w:r/>
             <w:r>
               <w:rPr>
+                <w:b/>
+                <w:i w:val="0"/>
+                <w:color w:val="1B7A3D"/>
                 <w:sz w:val="17"/>
               </w:rPr>
               <w:t>4 050 000</w:t>
@@ -435,7 +462,7 @@
       <w:tr>
         <w:tc>
           <w:tcPr>
-            <w:tcW w:type="dxa" w:w="2108"/>
+            <w:tcW w:type="dxa" w:w="2130"/>
           </w:tcPr>
           <w:p>
             <w:pPr>
@@ -444,28 +471,32 @@
             <w:r/>
             <w:r>
               <w:rPr>
+                <w:b/>
+                <w:i w:val="0"/>
                 <w:sz w:val="17"/>
               </w:rPr>
-              <w:t>3</w:t>
+              <w:t>A-03</w:t>
             </w:r>
           </w:p>
         </w:tc>
         <w:tc>
           <w:tcPr>
-            <w:tcW w:type="dxa" w:w="2108"/>
+            <w:tcW w:type="dxa" w:w="2130"/>
           </w:tcPr>
           <w:p>
             <w:r/>
             <w:r>
               <w:rPr>
                 <w:b/>
+                <w:i w:val="0"/>
+                <w:color w:val="4B5B6B"/>
                 <w:sz w:val="17"/>
               </w:rPr>
               <w:t>Bleu de travail mécanicien avec logo OPVN (les deux complets bleus)</w:t>
             </w:r>
             <w:r>
               <w:rPr>
-                <w:color w:val="344054"/>
+                <w:color w:val="4B5B6B"/>
                 <w:sz w:val="15"/>
               </w:rPr>
               <w:br/>
@@ -475,7 +506,7 @@
         </w:tc>
         <w:tc>
           <w:tcPr>
-            <w:tcW w:type="dxa" w:w="2108"/>
+            <w:tcW w:type="dxa" w:w="2130"/>
           </w:tcPr>
           <w:p>
             <w:pPr>
@@ -484,6 +515,8 @@
             <w:r/>
             <w:r>
               <w:rPr>
+                <w:b w:val="0"/>
+                <w:i w:val="0"/>
                 <w:sz w:val="17"/>
               </w:rPr>
               <w:t>24</w:t>
@@ -492,7 +525,7 @@
         </w:tc>
         <w:tc>
           <w:tcPr>
-            <w:tcW w:type="dxa" w:w="2108"/>
+            <w:tcW w:type="dxa" w:w="2130"/>
           </w:tcPr>
           <w:p>
             <w:pPr>
@@ -501,6 +534,8 @@
             <w:r/>
             <w:r>
               <w:rPr>
+                <w:b w:val="0"/>
+                <w:i w:val="0"/>
                 <w:sz w:val="17"/>
               </w:rPr>
               <w:t>22 500</w:t>
@@ -509,7 +544,7 @@
         </w:tc>
         <w:tc>
           <w:tcPr>
-            <w:tcW w:type="dxa" w:w="2108"/>
+            <w:tcW w:type="dxa" w:w="2130"/>
           </w:tcPr>
           <w:p>
             <w:pPr>
@@ -518,6 +553,9 @@
             <w:r/>
             <w:r>
               <w:rPr>
+                <w:b/>
+                <w:i w:val="0"/>
+                <w:color w:val="1B7A3D"/>
                 <w:sz w:val="17"/>
               </w:rPr>
               <w:t>540 000</w:t>
@@ -528,8 +566,8 @@
       <w:tr>
         <w:tc>
           <w:tcPr>
-            <w:tcW w:type="dxa" w:w="2108"/>
-            <w:shd w:val="clear" w:fill="F8FAFC"/>
+            <w:tcW w:type="dxa" w:w="2130"/>
+            <w:shd w:val="clear" w:fill="F2F9F3"/>
           </w:tcPr>
           <w:p>
             <w:pPr>
@@ -538,29 +576,33 @@
             <w:r/>
             <w:r>
               <w:rPr>
+                <w:b/>
+                <w:i w:val="0"/>
                 <w:sz w:val="17"/>
               </w:rPr>
-              <w:t>4</w:t>
+              <w:t>A-04</w:t>
             </w:r>
           </w:p>
         </w:tc>
         <w:tc>
           <w:tcPr>
-            <w:tcW w:type="dxa" w:w="2108"/>
-            <w:shd w:val="clear" w:fill="F8FAFC"/>
+            <w:tcW w:type="dxa" w:w="2130"/>
+            <w:shd w:val="clear" w:fill="F2F9F3"/>
           </w:tcPr>
           <w:p>
             <w:r/>
             <w:r>
               <w:rPr>
                 <w:b/>
+                <w:i w:val="0"/>
+                <w:color w:val="4B5B6B"/>
                 <w:sz w:val="17"/>
               </w:rPr>
               <w:t>Jalabia kaki / Ensemble à poches avec logo OPVN</w:t>
             </w:r>
             <w:r>
               <w:rPr>
-                <w:color w:val="344054"/>
+                <w:color w:val="4B5B6B"/>
                 <w:sz w:val="15"/>
               </w:rPr>
               <w:br/>
@@ -570,8 +612,8 @@
         </w:tc>
         <w:tc>
           <w:tcPr>
-            <w:tcW w:type="dxa" w:w="2108"/>
-            <w:shd w:val="clear" w:fill="F8FAFC"/>
+            <w:tcW w:type="dxa" w:w="2130"/>
+            <w:shd w:val="clear" w:fill="F2F9F3"/>
           </w:tcPr>
           <w:p>
             <w:pPr>
@@ -580,6 +622,8 @@
             <w:r/>
             <w:r>
               <w:rPr>
+                <w:b w:val="0"/>
+                <w:i w:val="0"/>
                 <w:sz w:val="17"/>
               </w:rPr>
               <w:t>80</w:t>
@@ -588,8 +632,8 @@
         </w:tc>
         <w:tc>
           <w:tcPr>
-            <w:tcW w:type="dxa" w:w="2108"/>
-            <w:shd w:val="clear" w:fill="F8FAFC"/>
+            <w:tcW w:type="dxa" w:w="2130"/>
+            <w:shd w:val="clear" w:fill="F2F9F3"/>
           </w:tcPr>
           <w:p>
             <w:pPr>
@@ -598,6 +642,8 @@
             <w:r/>
             <w:r>
               <w:rPr>
+                <w:b w:val="0"/>
+                <w:i w:val="0"/>
                 <w:sz w:val="17"/>
               </w:rPr>
               <w:t>29 500</w:t>
@@ -606,8 +652,8 @@
         </w:tc>
         <w:tc>
           <w:tcPr>
-            <w:tcW w:type="dxa" w:w="2108"/>
-            <w:shd w:val="clear" w:fill="F8FAFC"/>
+            <w:tcW w:type="dxa" w:w="2130"/>
+            <w:shd w:val="clear" w:fill="F2F9F3"/>
           </w:tcPr>
           <w:p>
             <w:pPr>
@@ -616,6 +662,9 @@
             <w:r/>
             <w:r>
               <w:rPr>
+                <w:b/>
+                <w:i w:val="0"/>
+                <w:color w:val="1B7A3D"/>
                 <w:sz w:val="17"/>
               </w:rPr>
               <w:t>2 360 000</w:t>
@@ -633,32 +682,47 @@
         <w:tblLook w:firstColumn="1" w:firstRow="1" w:lastColumn="0" w:lastRow="0" w:noHBand="0" w:noVBand="1" w:val="04A0"/>
       </w:tblPr>
       <w:tblGrid>
-        <w:gridCol w:w="5270"/>
-        <w:gridCol w:w="5270"/>
+        <w:gridCol w:w="5326"/>
+        <w:gridCol w:w="5326"/>
       </w:tblGrid>
       <w:tr>
         <w:tc>
           <w:tcPr>
-            <w:tcW w:type="dxa" w:w="5270"/>
+            <w:tcW w:type="dxa" w:w="5326"/>
+            <w:shd w:val="clear" w:fill="EAF5EC"/>
           </w:tcPr>
           <w:p>
             <w:pPr>
               <w:jc w:val="right"/>
             </w:pPr>
+            <w:r/>
             <w:r>
-              <w:t>Total HT (FCFA)</w:t>
+              <w:rPr>
+                <w:b/>
+                <w:i w:val="0"/>
+                <w:sz w:val="18"/>
+              </w:rPr>
+              <w:t>Montant total HT / Net à payer (FCFA)</w:t>
             </w:r>
           </w:p>
         </w:tc>
         <w:tc>
           <w:tcPr>
-            <w:tcW w:type="dxa" w:w="5270"/>
+            <w:tcW w:type="dxa" w:w="5326"/>
+            <w:shd w:val="clear" w:fill="EAF5EC"/>
           </w:tcPr>
           <w:p>
             <w:pPr>
               <w:jc w:val="right"/>
             </w:pPr>
+            <w:r/>
             <w:r>
+              <w:rPr>
+                <w:b/>
+                <w:i w:val="0"/>
+                <w:color w:val="1B7A3D"/>
+                <w:sz w:val="20"/>
+              </w:rPr>
               <w:t>13 450 000</w:t>
             </w:r>
           </w:p>
@@ -667,63 +731,40 @@
       <w:tr>
         <w:tc>
           <w:tcPr>
-            <w:tcW w:type="dxa" w:w="5270"/>
+            <w:tcW w:type="dxa" w:w="5326"/>
           </w:tcPr>
           <w:p>
             <w:pPr>
               <w:jc w:val="right"/>
             </w:pPr>
+            <w:r/>
             <w:r>
+              <w:rPr>
+                <w:b w:val="0"/>
+                <w:i w:val="0"/>
+                <w:sz w:val="17"/>
+              </w:rPr>
               <w:t>TVA</w:t>
             </w:r>
           </w:p>
         </w:tc>
         <w:tc>
           <w:tcPr>
-            <w:tcW w:type="dxa" w:w="5270"/>
+            <w:tcW w:type="dxa" w:w="5326"/>
           </w:tcPr>
           <w:p>
             <w:pPr>
               <w:jc w:val="right"/>
             </w:pPr>
-            <w:r>
-              <w:t>—</w:t>
-            </w:r>
-          </w:p>
-        </w:tc>
-      </w:tr>
-      <w:tr>
-        <w:tc>
-          <w:tcPr>
-            <w:tcW w:type="dxa" w:w="5270"/>
-            <w:shd w:val="clear" w:fill="E8F0FE"/>
-          </w:tcPr>
-          <w:p>
-            <w:pPr>
-              <w:jc w:val="right"/>
-            </w:pPr>
+            <w:r/>
             <w:r>
               <w:rPr>
-                <w:b/>
+                <w:b w:val="0"/>
+                <w:i w:val="0"/>
+                <w:color w:val="667085"/>
+                <w:sz w:val="17"/>
               </w:rPr>
-              <w:t>Total TTC / Net à payer (FCFA)</w:t>
-            </w:r>
-          </w:p>
-        </w:tc>
-        <w:tc>
-          <w:tcPr>
-            <w:tcW w:type="dxa" w:w="5270"/>
-            <w:shd w:val="clear" w:fill="E8F0FE"/>
-          </w:tcPr>
-          <w:p>
-            <w:pPr>
-              <w:jc w:val="right"/>
-            </w:pPr>
-            <w:r>
-              <w:rPr>
-                <w:b/>
-              </w:rPr>
-              <w:t>13 450 000</w:t>
+              <w:t>Non applicable</w:t>
             </w:r>
           </w:p>
         </w:tc>
@@ -732,25 +773,10 @@
     <w:p>
       <w:r>
         <w:rPr>
-          <w:sz w:val="17"/>
-        </w:rPr>
-        <w:t xml:space="preserve">Arrêté la présente facture proforma à la somme de : </w:t>
-      </w:r>
-      <w:r>
-        <w:rPr>
           <w:b/>
           <w:sz w:val="17"/>
         </w:rPr>
-        <w:t>Treize millions quatre cent cinquante mille (13 450 000) francs CFA.</w:t>
-      </w:r>
-    </w:p>
-    <w:p>
-      <w:r>
-        <w:rPr>
-          <w:b/>
-          <w:sz w:val="18"/>
-        </w:rPr>
-        <w:t>Détail des répartitions :</w:t>
+        <w:t>Arrêté à : Treize millions quatre cent cinquante mille (13 450 000) francs CFA.</w:t>
       </w:r>
     </w:p>
     <w:p>
@@ -758,32 +784,7 @@
         <w:pStyle w:val="ListBullet"/>
       </w:pPr>
       <w:r>
-        <w:t>• Planton : T-shirt vert + pantalon noir + casquette noire, + contre-veste marron (2ème complet).</w:t>
-        <w:br/>
-        <w:t>• Manœuvre : T-shirt vert + pantalon noir + casquette noire, + bleu comme mécaniciens.</w:t>
-        <w:br/>
-        <w:t>• Chauffeur : T-shirt orange + pantalon noir + casquette noire, + jalabia kaki / ensemble à poches (2ème complet).</w:t>
-        <w:br/>
-        <w:t>• Gardiens : T-shirt bleu marine + pantalon noir, + contre-veste marron (2ème complet).</w:t>
-        <w:br/>
-        <w:t>• Mécaniciens : bleu / bleu (les deux complets).</w:t>
-        <w:br/>
-        <w:t>• NB : Tous les articles avec le logo de l’OPVN.</w:t>
-      </w:r>
-    </w:p>
-    <w:p>
-      <w:r>
-        <w:rPr>
-          <w:b/>
-          <w:sz w:val="17"/>
-        </w:rPr>
-        <w:t xml:space="preserve">Conditions : </w:t>
-      </w:r>
-      <w:r>
-        <w:rPr>
-          <w:sz w:val="17"/>
-        </w:rPr>
-        <w:t>Prix en FCFA. Validité de l’offre : 30 jours. Délai de confection à convenir. Paiement : à préciser (espèces / virement / chèque).</w:t>
+        <w:t>Répartition : Planton vert/noir/casquette + contre-veste marron • Manœuvre vert/noir/casquette + bleu • Chauffeur orange/noir/casquette + jalabia kaki/poches • Gardiens bleu marine/noir + contre-veste marron • Mécaniciens bleu/bleu • Tous avec logo OPVN. Paiement : à convenir. Délai : à convenir.</w:t>
       </w:r>
     </w:p>
     <w:p/>
@@ -794,64 +795,63 @@
         <w:tblLook w:firstColumn="1" w:firstRow="1" w:lastColumn="0" w:lastRow="0" w:noHBand="0" w:noVBand="1" w:val="04A0"/>
       </w:tblPr>
       <w:tblGrid>
-        <w:gridCol w:w="5270"/>
-        <w:gridCol w:w="5270"/>
+        <w:gridCol w:w="5326"/>
+        <w:gridCol w:w="5326"/>
       </w:tblGrid>
       <w:tr>
         <w:tc>
           <w:tcPr>
-            <w:tcW w:type="dxa" w:w="5270"/>
+            <w:tcW w:type="dxa" w:w="5326"/>
           </w:tcPr>
           <w:p>
             <w:pPr>
               <w:jc w:val="center"/>
             </w:pPr>
+            <w:r/>
             <w:r>
-              <w:t>Le Fournisseur</w:t>
+              <w:rPr>
+                <w:b/>
+                <w:i w:val="0"/>
+                <w:color w:val="1B7A3D"/>
+                <w:sz w:val="18"/>
+              </w:rPr>
+              <w:t>Pour Sahel Confection</w:t>
               <w:br/>
               <w:br/>
               <w:br/>
-              <w:t>Signature &amp; Cachet</w:t>
+              <w:t>Cachet &amp; Signature</w:t>
             </w:r>
           </w:p>
         </w:tc>
         <w:tc>
           <w:tcPr>
-            <w:tcW w:type="dxa" w:w="5270"/>
+            <w:tcW w:type="dxa" w:w="5326"/>
           </w:tcPr>
           <w:p>
             <w:pPr>
               <w:jc w:val="center"/>
             </w:pPr>
+            <w:r/>
             <w:r>
-              <w:t>Le Client — OPVN</w:t>
-              <w:br/>
-              <w:t>Lu et approuvé, Bon pour accord</w:t>
+              <w:rPr>
+                <w:b w:val="0"/>
+                <w:i w:val="0"/>
+                <w:sz w:val="18"/>
+              </w:rPr>
+              <w:t>Pour OPVN — Bon pour accord</w:t>
               <w:br/>
               <w:br/>
               <w:br/>
-              <w:t>Signature &amp; Cachet</w:t>
+              <w:t>Cachet &amp; Signature</w:t>
             </w:r>
           </w:p>
         </w:tc>
       </w:tr>
     </w:tbl>
-    <w:p>
-      <w:pPr>
-        <w:jc w:val="center"/>
-      </w:pPr>
-      <w:r>
-        <w:rPr>
-          <w:color w:val="667085"/>
-          <w:sz w:val="15"/>
-        </w:rPr>
-        <w:t>Document établi à titre proforma — ne tient pas lieu de facture définitive. Merci de nous retourner un exemplaire signé.</w:t>
-      </w:r>
-    </w:p>
     <w:sectPr>
       <w:footerReference w:type="default" r:id="rId9"/>
       <w:pgSz w:w="12240" w:h="15840"/>
-      <w:pgMar w:top="680" w:right="850" w:bottom="680" w:left="850" w:header="720" w:footer="720" w:gutter="0"/>
+      <w:pgMar w:top="567" w:right="794" w:bottom="680" w:left="794" w:header="720" w:footer="720" w:gutter="0"/>
       <w:cols w:space="720"/>
       <w:docGrid w:linePitch="360"/>
     </w:sectPr>
@@ -868,10 +868,10 @@
     </w:pPr>
     <w:r>
       <w:rPr>
-        <w:color w:val="667085"/>
+        <w:color w:val="1B7A3D"/>
         <w:sz w:val="14"/>
       </w:rPr>
-      <w:t>Proforma N° PF-2026-0914-002 — 13 450 000 FCFA — OPVN — Tenues avec logo</w:t>
+      <w:t>Ets Sahel Confection — PF-2026-0914-002 — 13 450 000 FCFA — Tél +227 90 12 34 56</w:t>
     </w:r>
   </w:p>
 </w:ftr>
@@ -1773,9 +1773,6 @@
       </w:numPr>
       <w:contextualSpacing/>
     </w:pPr>
-    <w:rPr>
-      <w:sz w:val="17"/>
-    </w:rPr>
   </w:style>
   <w:style w:type="paragraph" w:styleId="ListBullet2">
     <w:name w:val="List Bullet 2"/>

</xml_diff>

<commit_message>
feat: +267k sur A (13 717 000) et +230k sur B (13 586 000)
Co-authored-by: NigerCertify-offensive-lab <openaiabou@gmail.com>
</commit_message>
<xml_diff>
--- a/Facture_Proforma_OPVN_Concurrent_A.docx
+++ b/Facture_Proforma_OPVN_Concurrent_A.docx
@@ -325,7 +325,7 @@
                 <w:i w:val="0"/>
                 <w:sz w:val="17"/>
               </w:rPr>
-              <w:t>32 500</w:t>
+              <w:t>33 000</w:t>
             </w:r>
           </w:p>
         </w:tc>
@@ -345,7 +345,7 @@
                 <w:color w:val="1B7A3D"/>
                 <w:sz w:val="17"/>
               </w:rPr>
-              <w:t>6 500 000</w:t>
+              <w:t>6 600 000</w:t>
             </w:r>
           </w:p>
         </w:tc>
@@ -433,7 +433,7 @@
                 <w:i w:val="0"/>
                 <w:sz w:val="17"/>
               </w:rPr>
-              <w:t>37 500</w:t>
+              <w:t>38 250</w:t>
             </w:r>
           </w:p>
         </w:tc>
@@ -454,7 +454,7 @@
                 <w:color w:val="1B7A3D"/>
                 <w:sz w:val="17"/>
               </w:rPr>
-              <w:t>4 050 000</w:t>
+              <w:t>4 131 000</w:t>
             </w:r>
           </w:p>
         </w:tc>
@@ -538,7 +538,7 @@
                 <w:i w:val="0"/>
                 <w:sz w:val="17"/>
               </w:rPr>
-              <w:t>22 500</w:t>
+              <w:t>22 750</w:t>
             </w:r>
           </w:p>
         </w:tc>
@@ -558,7 +558,7 @@
                 <w:color w:val="1B7A3D"/>
                 <w:sz w:val="17"/>
               </w:rPr>
-              <w:t>540 000</w:t>
+              <w:t>546 000</w:t>
             </w:r>
           </w:p>
         </w:tc>
@@ -646,7 +646,7 @@
                 <w:i w:val="0"/>
                 <w:sz w:val="17"/>
               </w:rPr>
-              <w:t>29 500</w:t>
+              <w:t>30 500</w:t>
             </w:r>
           </w:p>
         </w:tc>
@@ -667,7 +667,7 @@
                 <w:color w:val="1B7A3D"/>
                 <w:sz w:val="17"/>
               </w:rPr>
-              <w:t>2 360 000</w:t>
+              <w:t>2 440 000</w:t>
             </w:r>
           </w:p>
         </w:tc>
@@ -723,7 +723,7 @@
                 <w:color w:val="1B7A3D"/>
                 <w:sz w:val="20"/>
               </w:rPr>
-              <w:t>13 450 000</w:t>
+              <w:t>13 717 000</w:t>
             </w:r>
           </w:p>
         </w:tc>
@@ -776,7 +776,7 @@
           <w:b/>
           <w:sz w:val="17"/>
         </w:rPr>
-        <w:t>Arrêté à : Treize millions quatre cent cinquante mille (13 450 000) francs CFA.</w:t>
+        <w:t>Arrêté à : Treize millions sept cent dix-sept mille (13 717 000) francs CFA.</w:t>
       </w:r>
     </w:p>
     <w:p>
@@ -871,7 +871,7 @@
         <w:color w:val="1B7A3D"/>
         <w:sz w:val="14"/>
       </w:rPr>
-      <w:t>Ets Sahel Confection — PF-2026-0914-002 — 13 450 000 FCFA — Tél +227 90 12 34 56</w:t>
+      <w:t>Ets Sahel Confection — PF-2026-0914-002 — 13 717 000 FCFA — Tél +227 90 12 34 56</w:t>
     </w:r>
   </w:p>
 </w:ftr>

</xml_diff>